<commit_message>
Add DARIMA and WARMA forecasting models
</commit_message>
<xml_diff>
--- a/examples/multivariate/doc/05-target-centered-regression.docx
+++ b/examples/multivariate/doc/05-target-centered-regression.docx
@@ -2,13 +2,13 @@
 <file path=word/document.xml><?xml version="1.0" encoding="utf-8"?>
 <w:document xmlns:w="http://schemas.openxmlformats.org/wordprocessingml/2006/main" xmlns:m="http://schemas.openxmlformats.org/officeDocument/2006/math" xmlns:r="http://schemas.openxmlformats.org/officeDocument/2006/relationships" xmlns:o="urn:schemas-microsoft-com:office:office" xmlns:v="urn:schemas-microsoft-com:vml" xmlns:w10="urn:schemas-microsoft-com:office:word" xmlns:a="http://schemas.openxmlformats.org/drawingml/2006/main" xmlns:pic="http://schemas.openxmlformats.org/drawingml/2006/picture" xmlns:wp="http://schemas.openxmlformats.org/drawingml/2006/wordprocessingDrawing">
   <w:body>
-    <w:bookmarkStart w:id="18" w:name="target-centered-multivariate-forecasting"/>
+    <w:bookmarkStart w:id="18" w:name="Xa6f9780becd2a3c440858773a6e62185c515608"/>
     <w:p>
       <w:pPr>
         <w:pStyle w:val="Heading2"/>
       </w:pPr>
       <w:r>
-        <w:t xml:space="preserve">Target-Centered Multivariate Forecasting</w:t>
+        <w:t xml:space="preserve">Target-Centered Multivariate Forecasting with Deterministic Auxiliaries</w:t>
       </w:r>
     </w:p>
     <w:p>
@@ -93,7 +93,7 @@
         <w:t xml:space="preserve"> </w:t>
       </w:r>
       <w:r>
-        <w:t xml:space="preserve">2.0 using an existing benchmark from the package.</w:t>
+        <w:t xml:space="preserve">2.0 when the auxiliary variables follow deterministic laws of formation.</w:t>
       </w:r>
     </w:p>
     <w:p>
@@ -143,7 +143,7 @@
         <w:rPr>
           <w:rStyle w:val="CommentTok"/>
         </w:rPr>
-        <w:t xml:space="preserve"># Target-centered multivariate forecasting</w:t>
+        <w:t xml:space="preserve"># Target-centered multivariate forecasting with deterministic auxiliaries</w:t>
       </w:r>
       <w:r>
         <w:br/>
@@ -2422,7 +2422,7 @@
               <a:graphicData uri="http://schemas.openxmlformats.org/drawingml/2006/picture">
                 <pic:pic>
                   <pic:nvPicPr>
-                    <pic:cNvPr descr="C:\Git\cefet-rj-dal\tspredit\examples\multivariate\doc\05-target-centered-regression_files/4372e31d5b9698aa858f9f1d84aebdb169abcdc7.png" id="11" name="Picture"/>
+                    <pic:cNvPr descr="C:\Git\cefet-rj-dal\tspredit\examples\multivariate\doc\05-target-centered-regression_files/992ef7fbc41bc33ed5dee475c8246b538aa4af8a.png" id="11" name="Picture"/>
                     <pic:cNvPicPr>
                       <a:picLocks noChangeArrowheads="1" noChangeAspect="1"/>
                     </pic:cNvPicPr>
@@ -2512,7 +2512,7 @@
               <a:graphicData uri="http://schemas.openxmlformats.org/drawingml/2006/picture">
                 <pic:pic>
                   <pic:nvPicPr>
-                    <pic:cNvPr descr="C:\Git\cefet-rj-dal\tspredit\examples\multivariate\doc\05-target-centered-regression_files/e02ba6896d1227d5c6bf79a7b359db2f5b9bd3cc.png" id="14" name="Picture"/>
+                    <pic:cNvPr descr="C:\Git\cefet-rj-dal\tspredit\examples\multivariate\doc\05-target-centered-regression_files/9cb476dc3d3dd0248709cd5299edb08ec4709559.png" id="14" name="Picture"/>
                     <pic:cNvPicPr>
                       <a:picLocks noChangeArrowheads="1" noChangeAspect="1"/>
                     </pic:cNvPicPr>
@@ -2602,7 +2602,7 @@
               <a:graphicData uri="http://schemas.openxmlformats.org/drawingml/2006/picture">
                 <pic:pic>
                   <pic:nvPicPr>
-                    <pic:cNvPr descr="C:\Git\cefet-rj-dal\tspredit\examples\multivariate\doc\05-target-centered-regression_files/c382bc14bd207b07d0bf3a1aa4f56002ac865221.png" id="17" name="Picture"/>
+                    <pic:cNvPr descr="C:\Git\cefet-rj-dal\tspredit\examples\multivariate\doc\05-target-centered-regression_files/eeb7b0adfab0f2dccedded6c2c5b1d275d48a8cb.png" id="17" name="Picture"/>
                     <pic:cNvPicPr>
                       <a:picLocks noChangeArrowheads="1" noChangeAspect="1"/>
                     </pic:cNvPicPr>
@@ -2884,6 +2884,12 @@
       </w:r>
       <w:r>
         <w:t xml:space="preserve">family are often more appropriate than generic learners for deterministic auxiliary variables.</w:t>
+      </w:r>
+      <w:r>
+        <w:t xml:space="preserve"> </w:t>
+      </w:r>
+      <w:r>
+        <w:t xml:space="preserve">- This is the deterministic-auxiliary scenario; the next example in the sequence treats non-deterministic auxiliary variables as endogenous series with their own forecasting models.</w:t>
       </w:r>
     </w:p>
     <w:p>

</xml_diff>